<commit_message>
Ajusta minuta de despacho da ASSGER: contexto, etapas, indices SEI
Co-Authored-By: Claude Sonnet 5.5 <noreply@anthropic.com>
Claude-Session: https://claude.ai/code/session_01CvNgJ9uw3v6S3zr9Vmkpsw
</commit_message>
<xml_diff>
--- a/Despacho_ASSGER_minuta.docx
+++ b/Despacho_ASSGER_minuta.docx
@@ -81,6 +81,493 @@
           <w:b w:val="0"/>
         </w:rPr>
         <w:t>Assunto: proposta da DIREO de aprimoramento do fluxo de inicialização de novos processos administrativos (CI CENTRAL/DIREO nº 77 – SEI 139773496)</w:t>
+      </w:r>
+    </w:p>
+    <w:p>
+      <w:pPr>
+        <w:keepNext/>
+        <w:spacing w:before="240" w:after="80"/>
+      </w:pPr>
+      <w:r>
+        <w:rPr>
+          <w:b/>
+          <w:sz w:val="24"/>
+        </w:rPr>
+        <w:t>Contexto e finalidade deste despacho</w:t>
+      </w:r>
+    </w:p>
+    <w:p>
+      <w:r>
+        <w:rPr>
+          <w:b w:val="0"/>
+        </w:rPr>
+        <w:t>A Diretoria de Engenharia e Operação – DIREO propôs, por meio da CI CENTRAL/DIREO nº 77 (SEI 139773496), que a CENTRAL avalie a adoção de uma etapa de triagem prévia à abertura de novos processos no SEI. A finalidade seria verificar se já existe processo sobre o mesmo assunto antes de autuar um novo, evitando a abertura de processos paralelos e a fragmentação de documentos e informações.</w:t>
+      </w:r>
+    </w:p>
+    <w:p>
+      <w:r>
+        <w:rPr>
+          <w:b w:val="0"/>
+        </w:rPr>
+        <w:t>O processo já recebeu encaminhamentos da Chefia de Gabinete e da DIRAF e manifestações da Auditoria Interna e dos Pontos Focais do SEI. Este despacho reúne o que já consta dos autos, mostra o que o Regimento Interno estabelece, aponta o que ainda falta e propõe os próximos encaminhamentos, em ordem.</w:t>
+      </w:r>
+    </w:p>
+    <w:p>
+      <w:pPr>
+        <w:keepNext/>
+        <w:spacing w:before="240" w:after="80"/>
+      </w:pPr>
+      <w:r>
+        <w:rPr>
+          <w:b/>
+          <w:sz w:val="24"/>
+        </w:rPr>
+        <w:t>Tramitação até aqui</w:t>
+      </w:r>
+    </w:p>
+    <w:tbl>
+      <w:tblPr>
+        <w:tblStyle w:val="TableGrid"/>
+        <w:tblW w:type="auto" w:w="0"/>
+        <w:tblLook w:firstColumn="1" w:firstRow="1" w:lastColumn="0" w:lastRow="0" w:noHBand="0" w:noVBand="1" w:val="04A0"/>
+      </w:tblPr>
+      <w:tblGrid>
+        <w:gridCol w:w="2436"/>
+        <w:gridCol w:w="2436"/>
+        <w:gridCol w:w="2436"/>
+        <w:gridCol w:w="2436"/>
+      </w:tblGrid>
+      <w:tr>
+        <w:tc>
+          <w:tcPr>
+            <w:tcW w:type="dxa" w:w="1304"/>
+            <w:shd w:val="clear" w:color="auto" w:fill="D9E2F3"/>
+          </w:tcPr>
+          <w:p>
+            <w:r/>
+            <w:r>
+              <w:rPr>
+                <w:b/>
+                <w:sz w:val="20"/>
+              </w:rPr>
+              <w:t>Data</w:t>
+            </w:r>
+          </w:p>
+        </w:tc>
+        <w:tc>
+          <w:tcPr>
+            <w:tcW w:type="dxa" w:w="1304"/>
+            <w:shd w:val="clear" w:color="auto" w:fill="D9E2F3"/>
+          </w:tcPr>
+          <w:p>
+            <w:r/>
+            <w:r>
+              <w:rPr>
+                <w:b/>
+                <w:sz w:val="20"/>
+              </w:rPr>
+              <w:t>Nº SEI</w:t>
+            </w:r>
+          </w:p>
+        </w:tc>
+        <w:tc>
+          <w:tcPr>
+            <w:tcW w:type="dxa" w:w="4819"/>
+            <w:shd w:val="clear" w:color="auto" w:fill="D9E2F3"/>
+          </w:tcPr>
+          <w:p>
+            <w:r/>
+            <w:r>
+              <w:rPr>
+                <w:b/>
+                <w:sz w:val="20"/>
+              </w:rPr>
+              <w:t>Documento</w:t>
+            </w:r>
+          </w:p>
+        </w:tc>
+        <w:tc>
+          <w:tcPr>
+            <w:tcW w:type="dxa" w:w="2098"/>
+            <w:shd w:val="clear" w:color="auto" w:fill="D9E2F3"/>
+          </w:tcPr>
+          <w:p>
+            <w:r/>
+            <w:r>
+              <w:rPr>
+                <w:b/>
+                <w:sz w:val="20"/>
+              </w:rPr>
+              <w:t>Unidade</w:t>
+            </w:r>
+          </w:p>
+        </w:tc>
+      </w:tr>
+      <w:tr>
+        <w:tc>
+          <w:tcPr>
+            <w:tcW w:type="dxa" w:w="1304"/>
+          </w:tcPr>
+          <w:p>
+            <w:r/>
+            <w:r>
+              <w:rPr>
+                <w:sz w:val="20"/>
+              </w:rPr>
+              <w:t>24/08/2026</w:t>
+            </w:r>
+          </w:p>
+        </w:tc>
+        <w:tc>
+          <w:tcPr>
+            <w:tcW w:type="dxa" w:w="1304"/>
+          </w:tcPr>
+          <w:p>
+            <w:r/>
+            <w:r>
+              <w:rPr>
+                <w:sz w:val="20"/>
+              </w:rPr>
+              <w:t>139773496</w:t>
+            </w:r>
+          </w:p>
+        </w:tc>
+        <w:tc>
+          <w:tcPr>
+            <w:tcW w:type="dxa" w:w="4819"/>
+          </w:tcPr>
+          <w:p>
+            <w:r/>
+            <w:r>
+              <w:rPr>
+                <w:sz w:val="20"/>
+              </w:rPr>
+              <w:t>CI CENTRAL/DIREO nº 77 – proposta</w:t>
+            </w:r>
+          </w:p>
+        </w:tc>
+        <w:tc>
+          <w:tcPr>
+            <w:tcW w:type="dxa" w:w="2098"/>
+          </w:tcPr>
+          <w:p>
+            <w:r/>
+            <w:r>
+              <w:rPr>
+                <w:sz w:val="20"/>
+              </w:rPr>
+              <w:t>DIREO</w:t>
+            </w:r>
+          </w:p>
+        </w:tc>
+      </w:tr>
+      <w:tr>
+        <w:tc>
+          <w:tcPr>
+            <w:tcW w:type="dxa" w:w="1304"/>
+          </w:tcPr>
+          <w:p>
+            <w:r/>
+            <w:r>
+              <w:rPr>
+                <w:sz w:val="20"/>
+              </w:rPr>
+              <w:t>26/08/2026</w:t>
+            </w:r>
+          </w:p>
+        </w:tc>
+        <w:tc>
+          <w:tcPr>
+            <w:tcW w:type="dxa" w:w="1304"/>
+          </w:tcPr>
+          <w:p>
+            <w:r/>
+            <w:r>
+              <w:rPr>
+                <w:sz w:val="20"/>
+              </w:rPr>
+              <w:t>139818224</w:t>
+            </w:r>
+          </w:p>
+        </w:tc>
+        <w:tc>
+          <w:tcPr>
+            <w:tcW w:type="dxa" w:w="4819"/>
+          </w:tcPr>
+          <w:p>
+            <w:r/>
+            <w:r>
+              <w:rPr>
+                <w:sz w:val="20"/>
+              </w:rPr>
+              <w:t>Despacho de encaminhamento (PRESI para ciência; ASSGER e AUD)</w:t>
+            </w:r>
+          </w:p>
+        </w:tc>
+        <w:tc>
+          <w:tcPr>
+            <w:tcW w:type="dxa" w:w="2098"/>
+          </w:tcPr>
+          <w:p>
+            <w:r/>
+            <w:r>
+              <w:rPr>
+                <w:sz w:val="20"/>
+              </w:rPr>
+              <w:t>CHEGAB</w:t>
+            </w:r>
+          </w:p>
+        </w:tc>
+      </w:tr>
+      <w:tr>
+        <w:tc>
+          <w:tcPr>
+            <w:tcW w:type="dxa" w:w="1304"/>
+          </w:tcPr>
+          <w:p>
+            <w:r/>
+            <w:r>
+              <w:rPr>
+                <w:sz w:val="20"/>
+              </w:rPr>
+              <w:t>27/08/2026</w:t>
+            </w:r>
+          </w:p>
+        </w:tc>
+        <w:tc>
+          <w:tcPr>
+            <w:tcW w:type="dxa" w:w="1304"/>
+          </w:tcPr>
+          <w:p>
+            <w:r/>
+            <w:r>
+              <w:rPr>
+                <w:sz w:val="20"/>
+              </w:rPr>
+              <w:t>140109406</w:t>
+            </w:r>
+          </w:p>
+        </w:tc>
+        <w:tc>
+          <w:tcPr>
+            <w:tcW w:type="dxa" w:w="4819"/>
+          </w:tcPr>
+          <w:p>
+            <w:r/>
+            <w:r>
+              <w:rPr>
+                <w:sz w:val="20"/>
+              </w:rPr>
+              <w:t>Manifestação preliminar</w:t>
+            </w:r>
+          </w:p>
+        </w:tc>
+        <w:tc>
+          <w:tcPr>
+            <w:tcW w:type="dxa" w:w="2098"/>
+          </w:tcPr>
+          <w:p>
+            <w:r/>
+            <w:r>
+              <w:rPr>
+                <w:sz w:val="20"/>
+              </w:rPr>
+              <w:t>Auditoria Interna</w:t>
+            </w:r>
+          </w:p>
+        </w:tc>
+      </w:tr>
+      <w:tr>
+        <w:tc>
+          <w:tcPr>
+            <w:tcW w:type="dxa" w:w="1304"/>
+          </w:tcPr>
+          <w:p>
+            <w:r/>
+            <w:r>
+              <w:rPr>
+                <w:sz w:val="20"/>
+              </w:rPr>
+              <w:t>27/08/2026</w:t>
+            </w:r>
+          </w:p>
+        </w:tc>
+        <w:tc>
+          <w:tcPr>
+            <w:tcW w:type="dxa" w:w="1304"/>
+          </w:tcPr>
+          <w:p>
+            <w:r/>
+            <w:r>
+              <w:rPr>
+                <w:sz w:val="20"/>
+              </w:rPr>
+              <w:t>140164661</w:t>
+            </w:r>
+          </w:p>
+        </w:tc>
+        <w:tc>
+          <w:tcPr>
+            <w:tcW w:type="dxa" w:w="4819"/>
+          </w:tcPr>
+          <w:p>
+            <w:r/>
+            <w:r>
+              <w:rPr>
+                <w:sz w:val="20"/>
+              </w:rPr>
+              <w:t>Despacho de encaminhamento (PRESI, ASSGER, Pontos Focais, DIRAF com vistas à SUPTIN)</w:t>
+            </w:r>
+          </w:p>
+        </w:tc>
+        <w:tc>
+          <w:tcPr>
+            <w:tcW w:type="dxa" w:w="2098"/>
+          </w:tcPr>
+          <w:p>
+            <w:r/>
+            <w:r>
+              <w:rPr>
+                <w:sz w:val="20"/>
+              </w:rPr>
+              <w:t>CHEGAB</w:t>
+            </w:r>
+          </w:p>
+        </w:tc>
+      </w:tr>
+      <w:tr>
+        <w:tc>
+          <w:tcPr>
+            <w:tcW w:type="dxa" w:w="1304"/>
+          </w:tcPr>
+          <w:p>
+            <w:r/>
+            <w:r>
+              <w:rPr>
+                <w:sz w:val="20"/>
+              </w:rPr>
+              <w:t>28/08/2026</w:t>
+            </w:r>
+          </w:p>
+        </w:tc>
+        <w:tc>
+          <w:tcPr>
+            <w:tcW w:type="dxa" w:w="1304"/>
+          </w:tcPr>
+          <w:p>
+            <w:r/>
+            <w:r>
+              <w:rPr>
+                <w:sz w:val="20"/>
+              </w:rPr>
+              <w:t>140181700</w:t>
+            </w:r>
+          </w:p>
+        </w:tc>
+        <w:tc>
+          <w:tcPr>
+            <w:tcW w:type="dxa" w:w="4819"/>
+          </w:tcPr>
+          <w:p>
+            <w:r/>
+            <w:r>
+              <w:rPr>
+                <w:sz w:val="20"/>
+              </w:rPr>
+              <w:t>Despacho de encaminhamento à SUPTIN</w:t>
+            </w:r>
+          </w:p>
+        </w:tc>
+        <w:tc>
+          <w:tcPr>
+            <w:tcW w:type="dxa" w:w="2098"/>
+          </w:tcPr>
+          <w:p>
+            <w:r/>
+            <w:r>
+              <w:rPr>
+                <w:sz w:val="20"/>
+              </w:rPr>
+              <w:t>DIRAF</w:t>
+            </w:r>
+          </w:p>
+        </w:tc>
+      </w:tr>
+      <w:tr>
+        <w:tc>
+          <w:tcPr>
+            <w:tcW w:type="dxa" w:w="1304"/>
+          </w:tcPr>
+          <w:p>
+            <w:r/>
+            <w:r>
+              <w:rPr>
+                <w:sz w:val="20"/>
+              </w:rPr>
+              <w:t>01/09/2026</w:t>
+            </w:r>
+          </w:p>
+        </w:tc>
+        <w:tc>
+          <w:tcPr>
+            <w:tcW w:type="dxa" w:w="1304"/>
+          </w:tcPr>
+          <w:p>
+            <w:r/>
+            <w:r>
+              <w:rPr>
+                <w:sz w:val="20"/>
+              </w:rPr>
+              <w:t>140422979</w:t>
+            </w:r>
+          </w:p>
+        </w:tc>
+        <w:tc>
+          <w:tcPr>
+            <w:tcW w:type="dxa" w:w="4819"/>
+          </w:tcPr>
+          <w:p>
+            <w:r/>
+            <w:r>
+              <w:rPr>
+                <w:sz w:val="20"/>
+              </w:rPr>
+              <w:t>Manifestação dos Pontos Focais</w:t>
+            </w:r>
+          </w:p>
+        </w:tc>
+        <w:tc>
+          <w:tcPr>
+            <w:tcW w:type="dxa" w:w="2098"/>
+          </w:tcPr>
+          <w:p>
+            <w:r/>
+            <w:r>
+              <w:rPr>
+                <w:sz w:val="20"/>
+              </w:rPr>
+              <w:t>Pontos Focais do SEI</w:t>
+            </w:r>
+          </w:p>
+        </w:tc>
+      </w:tr>
+    </w:tbl>
+    <w:p>
+      <w:pPr>
+        <w:spacing w:after="40"/>
+      </w:pPr>
+    </w:p>
+    <w:p>
+      <w:pPr>
+        <w:keepNext/>
+        <w:spacing w:before="240" w:after="80"/>
+      </w:pPr>
+      <w:r>
+        <w:rPr>
+          <w:b/>
+          <w:sz w:val="24"/>
+        </w:rPr>
+        <w:t>Manifestação da ASSGER</w:t>
       </w:r>
     </w:p>
     <w:p>
@@ -488,7 +975,7 @@
         <w:rPr>
           <w:b w:val="0"/>
         </w:rPr>
-        <w:t>Não há, no Regimento, atribuição expressa a unidade específica para a triagem prévia à abertura de processos. A definição de unidade responsável e de suas competências é matéria de estrutura e atribuições.</w:t>
+        <w:t>Fonte: Regimento Interno da CENTRAL, emissão original de 17/06/2024 (SEI 77097301, Processo SEI-100006/000240/2022). Não há atribuição expressa a unidade específica para a triagem prévia à abertura de processos. A definição de unidade responsável e de suas competências é matéria de estrutura e atribuições.</w:t>
       </w:r>
     </w:p>
     <w:p>
@@ -516,7 +1003,7 @@
         <w:t>Auditoria Interna (SEI 140109406) – aponta</w:t>
       </w:r>
       <w:r>
-        <w:t xml:space="preserve"> os instrumentos já existentes (Processo SEI-100006/001550/2020; Portaria Conjunta APERJ/CENTRAL nº 31/2022; Portaria CENTRAL SEI nº 265/2021; Manual de Gestão de Documentos; Manual de Gestão de Protocolo – Padronização; Plano de Classificação; Tabela de Temporalidade; designação de pontos focais do SEI; Procedimentos Padrão de cadastramento de usuários e de elaboração de instrumentos normativos) e pede que se verifique se a dificuldade decorre de insuficiência normativa ou de não observância das normas e das ferramentas de vinculação do SEI. Recomenda que nenhum dos modelos de referência (UNIRIO, TCM-SP, MPRS, TCU) seja adotado automaticamente.</w:t>
+        <w:t xml:space="preserve"> os instrumentos já existentes (Processo SEI-100006/001550/2020; Portaria Conjunta APERJ/CENTRAL nº 31/2022; Portaria CENTRAL SEI nº 265/2021; Manual de Gestão de Documentos; Manual de Gestão de Protocolo – Padronização; Plano de Classificação; Tabela de Temporalidade; designação de pontos focais do SEI, Processo SEI-100006/000768/2025; Procedimentos Padrão de cadastramento de usuários e de elaboração de instrumentos normativos) e pede que se verifique se a dificuldade decorre de insuficiência normativa ou de não observância das normas e das ferramentas de vinculação do SEI. Recomenda que nenhum dos modelos de referência (UNIRIO, TCM-SP, MPRS, TCU) seja adotado automaticamente.</w:t>
       </w:r>
     </w:p>
     <w:p>
@@ -531,7 +1018,7 @@
         <w:t>Pontos Focais do SEI (SEI 140422979) – informam</w:t>
       </w:r>
       <w:r>
-        <w:t xml:space="preserve"> que a proposta envolve parametrização do SEI (triagem, perfis e permissões, pesquisa e vinculação de processos, padronização de assuntos e tipos processuais), que podem avaliar limitações e orientações de uso e que é fundamental o preenchimento adequado de todos os campos na abertura do processo. Destacam que a definição da unidade responsável e de suas competências cabe às instâncias competentes.</w:t>
+        <w:t xml:space="preserve"> que a proposta envolve parametrização do SEI (triagem, perfis e permissões, pesquisa e vinculação de processos, padronização de assuntos e tipos processuais), que podem avaliar limitações e orientações de uso, e que é fundamental o preenchimento adequado de todos os campos na abertura do processo. Destacam que a definição da unidade responsável e de suas competências cabe às instâncias competentes.</w:t>
       </w:r>
     </w:p>
     <w:p>
@@ -571,10 +1058,10 @@
         <w:rPr>
           <w:b/>
         </w:rPr>
-        <w:t>GERADM/SUPADM:</w:t>
+        <w:t>DIRAF, SUPADM e GERADM:</w:t>
       </w:r>
       <w:r>
-        <w:t xml:space="preserve"> unidades que, pelo Regimento, gerenciam o protocolo e o SEI, ainda não foram ouvidas.</w:t>
+        <w:t xml:space="preserve"> unidades que, pelo Regimento, gerenciam o protocolo e o SEI, ainda não foram ouvidas, e não há modelo de fluxo proposto por elas.</w:t>
       </w:r>
     </w:p>
     <w:p>
@@ -604,7 +1091,7 @@
         <w:t>SUPTIN:</w:t>
       </w:r>
       <w:r>
-        <w:t xml:space="preserve"> encaminhamento pendente (DIRAF, SEI 140181700), sem manifestação.</w:t>
+        <w:t xml:space="preserve"> encaminhamento pendente (DIRAF, SEI 140181700), sem manifestação, à espera de um modelo a avaliar.</w:t>
       </w:r>
     </w:p>
     <w:p>
@@ -619,7 +1106,7 @@
         <w:t>Instrumentos em vigor:</w:t>
       </w:r>
       <w:r>
-        <w:t xml:space="preserve"> os instrumentos citados pela Auditoria não constam como documentos dos autos.</w:t>
+        <w:t xml:space="preserve"> os citados pela Auditoria não constam como documentos dos autos.</w:t>
       </w:r>
     </w:p>
     <w:p>
@@ -637,14 +1124,64 @@
     </w:p>
     <w:p>
       <w:pPr>
-        <w:spacing w:after="80"/>
+        <w:spacing w:after="60"/>
       </w:pPr>
       <w:r>
         <w:rPr>
           <w:b w:val="0"/>
         </w:rPr>
-        <w:t>Sugere-se que a Chefia de Gabinete encaminhe o processo conforme o quadro abaixo:</w:t>
+        <w:t>Sugere-se que a Chefia de Gabinete encaminhe o processo em três etapas, nesta ordem, pelos motivos abaixo:</w:t>
       </w:r>
+    </w:p>
+    <w:p>
+      <w:pPr>
+        <w:pStyle w:val="ListBullet"/>
+        <w:spacing w:after="60"/>
+      </w:pPr>
+      <w:r>
+        <w:rPr>
+          <w:b/>
+        </w:rPr>
+        <w:t>Etapa 1 – Levantamento (itens 1 a 4):</w:t>
+      </w:r>
+      <w:r>
+        <w:t xml:space="preserve"> a Auditoria pediu que se verifique se o problema é de norma ou de aplicação (SEI 140109406). Para isso é preciso ouvir quem relatou o problema (DIREO) e as unidades que, pelo Regimento, gerenciam o protocolo e o SEI (DIRAF, SUPADM e GERADM – Arts. 26, 29 e 31), além da Comissão de Gestão de Documentos, sugerida pela Auditoria e ainda não ouvida.</w:t>
+      </w:r>
+    </w:p>
+    <w:p>
+      <w:pPr>
+        <w:pStyle w:val="ListBullet"/>
+        <w:spacing w:after="60"/>
+      </w:pPr>
+      <w:r>
+        <w:rPr>
+          <w:b/>
+        </w:rPr>
+        <w:t>Etapa 2 – Análise técnica no SEI (item 5):</w:t>
+      </w:r>
+      <w:r>
+        <w:t xml:space="preserve"> a SUPTIN e os Pontos Focais só podem analisar o que for proposto. Hoje não há modelo proposto pela SUPADM ou pela GERADM, e os Pontos Focais já indicaram que avaliarão conforme a política adotada (SEI 140422979).</w:t>
+      </w:r>
+    </w:p>
+    <w:p>
+      <w:pPr>
+        <w:pStyle w:val="ListBullet"/>
+        <w:spacing w:after="60"/>
+      </w:pPr>
+      <w:r>
+        <w:rPr>
+          <w:b/>
+        </w:rPr>
+        <w:t>Etapa 3 – Consolidação e decisão (itens 6 e 7):</w:t>
+      </w:r>
+      <w:r>
+        <w:t xml:space="preserve"> a ASSGER reúne as manifestações (Art. 18), e a DIREXE decide sobre eventual mudança de estrutura ou de competências (Arts. 14 e 4º).</w:t>
+      </w:r>
+    </w:p>
+    <w:p>
+      <w:pPr>
+        <w:spacing w:after="40"/>
+      </w:pPr>
     </w:p>
     <w:tbl>
       <w:tblPr>
@@ -653,15 +1190,14 @@
         <w:tblLook w:firstColumn="1" w:firstRow="1" w:lastColumn="0" w:lastRow="0" w:noHBand="0" w:noVBand="1" w:val="04A0"/>
       </w:tblPr>
       <w:tblGrid>
-        <w:gridCol w:w="2436"/>
-        <w:gridCol w:w="2436"/>
-        <w:gridCol w:w="2436"/>
-        <w:gridCol w:w="2436"/>
+        <w:gridCol w:w="3249"/>
+        <w:gridCol w:w="3249"/>
+        <w:gridCol w:w="3249"/>
       </w:tblGrid>
       <w:tr>
         <w:tc>
           <w:tcPr>
-            <w:tcW w:type="dxa" w:w="510"/>
+            <w:tcW w:type="dxa" w:w="567"/>
             <w:shd w:val="clear" w:color="auto" w:fill="D9E2F3"/>
           </w:tcPr>
           <w:p>
@@ -677,7 +1213,7 @@
         </w:tc>
         <w:tc>
           <w:tcPr>
-            <w:tcW w:type="dxa" w:w="1928"/>
+            <w:tcW w:type="dxa" w:w="2381"/>
             <w:shd w:val="clear" w:color="auto" w:fill="D9E2F3"/>
           </w:tcPr>
           <w:p>
@@ -693,7 +1229,7 @@
         </w:tc>
         <w:tc>
           <w:tcPr>
-            <w:tcW w:type="dxa" w:w="4535"/>
+            <w:tcW w:type="dxa" w:w="6406"/>
             <w:shd w:val="clear" w:color="auto" w:fill="D9E2F3"/>
           </w:tcPr>
           <w:p>
@@ -707,27 +1243,11 @@
             </w:r>
           </w:p>
         </w:tc>
-        <w:tc>
-          <w:tcPr>
-            <w:tcW w:type="dxa" w:w="3005"/>
-            <w:shd w:val="clear" w:color="auto" w:fill="D9E2F3"/>
-          </w:tcPr>
-          <w:p>
-            <w:r/>
-            <w:r>
-              <w:rPr>
-                <w:b/>
-                <w:sz w:val="20"/>
-              </w:rPr>
-              <w:t>Motivo</w:t>
-            </w:r>
-          </w:p>
-        </w:tc>
       </w:tr>
       <w:tr>
         <w:tc>
           <w:tcPr>
-            <w:tcW w:type="dxa" w:w="510"/>
+            <w:tcW w:type="dxa" w:w="567"/>
           </w:tcPr>
           <w:p>
             <w:r/>
@@ -742,7 +1262,7 @@
         </w:tc>
         <w:tc>
           <w:tcPr>
-            <w:tcW w:type="dxa" w:w="1928"/>
+            <w:tcW w:type="dxa" w:w="2381"/>
           </w:tcPr>
           <w:p>
             <w:r/>
@@ -756,7 +1276,7 @@
         </w:tc>
         <w:tc>
           <w:tcPr>
-            <w:tcW w:type="dxa" w:w="4535"/>
+            <w:tcW w:type="dxa" w:w="6406"/>
           </w:tcPr>
           <w:p>
             <w:r/>
@@ -768,25 +1288,11 @@
             </w:r>
           </w:p>
         </w:tc>
-        <w:tc>
-          <w:tcPr>
-            <w:tcW w:type="dxa" w:w="3005"/>
-          </w:tcPr>
-          <w:p>
-            <w:r/>
-            <w:r>
-              <w:rPr>
-                <w:sz w:val="20"/>
-              </w:rPr>
-              <w:t>Distinguir se a dificuldade é falta de norma ou falta de aplicação</w:t>
-            </w:r>
-          </w:p>
-        </w:tc>
       </w:tr>
       <w:tr>
         <w:tc>
           <w:tcPr>
-            <w:tcW w:type="dxa" w:w="510"/>
+            <w:tcW w:type="dxa" w:w="567"/>
           </w:tcPr>
           <w:p>
             <w:r/>
@@ -801,7 +1307,7 @@
         </w:tc>
         <w:tc>
           <w:tcPr>
-            <w:tcW w:type="dxa" w:w="1928"/>
+            <w:tcW w:type="dxa" w:w="2381"/>
           </w:tcPr>
           <w:p>
             <w:r/>
@@ -815,7 +1321,7 @@
         </w:tc>
         <w:tc>
           <w:tcPr>
-            <w:tcW w:type="dxa" w:w="4535"/>
+            <w:tcW w:type="dxa" w:w="6406"/>
           </w:tcPr>
           <w:p>
             <w:r/>
@@ -823,21 +1329,7 @@
               <w:rPr>
                 <w:sz w:val="20"/>
               </w:rPr>
-              <w:t>Informar como o protocolo e o SEI são geridos hoje; se o Manual de Gestão de Protocolo prevê quem abre e autua processos; e se a duplicidade de processos é recorrente</w:t>
-            </w:r>
-          </w:p>
-        </w:tc>
-        <w:tc>
-          <w:tcPr>
-            <w:tcW w:type="dxa" w:w="3005"/>
-          </w:tcPr>
-          <w:p>
-            <w:r/>
-            <w:r>
-              <w:rPr>
-                <w:sz w:val="20"/>
-              </w:rPr>
-              <w:t>Unidades que gerenciam protocolo e SEI (Arts. 26, 29 e 31)</w:t>
+              <w:t>(a) Informar como o protocolo e o SEI são geridos hoje e se o Manual de Gestão de Protocolo prevê quem abre e autua processos; (b) informar se a duplicidade de processos é recorrente; (c) manifestar-se sobre a proposta da DIREO e, se entenderem cabível, apresentar proposta de fluxo</w:t>
             </w:r>
           </w:p>
         </w:tc>
@@ -845,7 +1337,7 @@
       <w:tr>
         <w:tc>
           <w:tcPr>
-            <w:tcW w:type="dxa" w:w="510"/>
+            <w:tcW w:type="dxa" w:w="567"/>
           </w:tcPr>
           <w:p>
             <w:r/>
@@ -860,7 +1352,7 @@
         </w:tc>
         <w:tc>
           <w:tcPr>
-            <w:tcW w:type="dxa" w:w="1928"/>
+            <w:tcW w:type="dxa" w:w="2381"/>
           </w:tcPr>
           <w:p>
             <w:r/>
@@ -874,7 +1366,7 @@
         </w:tc>
         <w:tc>
           <w:tcPr>
-            <w:tcW w:type="dxa" w:w="4535"/>
+            <w:tcW w:type="dxa" w:w="6406"/>
           </w:tcPr>
           <w:p>
             <w:r/>
@@ -886,25 +1378,11 @@
             </w:r>
           </w:p>
         </w:tc>
-        <w:tc>
-          <w:tcPr>
-            <w:tcW w:type="dxa" w:w="3005"/>
-          </w:tcPr>
-          <w:p>
-            <w:r/>
-            <w:r>
-              <w:rPr>
-                <w:sz w:val="20"/>
-              </w:rPr>
-              <w:t>Sugestão da Auditoria (SEI 140109406)</w:t>
-            </w:r>
-          </w:p>
-        </w:tc>
       </w:tr>
       <w:tr>
         <w:tc>
           <w:tcPr>
-            <w:tcW w:type="dxa" w:w="510"/>
+            <w:tcW w:type="dxa" w:w="567"/>
           </w:tcPr>
           <w:p>
             <w:r/>
@@ -919,7 +1397,7 @@
         </w:tc>
         <w:tc>
           <w:tcPr>
-            <w:tcW w:type="dxa" w:w="1928"/>
+            <w:tcW w:type="dxa" w:w="2381"/>
           </w:tcPr>
           <w:p>
             <w:r/>
@@ -933,7 +1411,7 @@
         </w:tc>
         <w:tc>
           <w:tcPr>
-            <w:tcW w:type="dxa" w:w="4535"/>
+            <w:tcW w:type="dxa" w:w="6406"/>
           </w:tcPr>
           <w:p>
             <w:r/>
@@ -945,25 +1423,11 @@
             </w:r>
           </w:p>
         </w:tc>
-        <w:tc>
-          <w:tcPr>
-            <w:tcW w:type="dxa" w:w="3005"/>
-          </w:tcPr>
-          <w:p>
-            <w:r/>
-            <w:r>
-              <w:rPr>
-                <w:sz w:val="20"/>
-              </w:rPr>
-              <w:t>Permitir a conferência do que já está regulado</w:t>
-            </w:r>
-          </w:p>
-        </w:tc>
       </w:tr>
       <w:tr>
         <w:tc>
           <w:tcPr>
-            <w:tcW w:type="dxa" w:w="510"/>
+            <w:tcW w:type="dxa" w:w="567"/>
           </w:tcPr>
           <w:p>
             <w:r/>
@@ -978,7 +1442,7 @@
         </w:tc>
         <w:tc>
           <w:tcPr>
-            <w:tcW w:type="dxa" w:w="1928"/>
+            <w:tcW w:type="dxa" w:w="2381"/>
           </w:tcPr>
           <w:p>
             <w:r/>
@@ -992,7 +1456,7 @@
         </w:tc>
         <w:tc>
           <w:tcPr>
-            <w:tcW w:type="dxa" w:w="4535"/>
+            <w:tcW w:type="dxa" w:w="6406"/>
           </w:tcPr>
           <w:p>
             <w:r/>
@@ -1000,21 +1464,7 @@
               <w:rPr>
                 <w:sz w:val="20"/>
               </w:rPr>
-              <w:t>Após as respostas acima, indicar limitações, necessidades de parametrização e orientações de uso, conforme o modelo que vier a ser considerado</w:t>
-            </w:r>
-          </w:p>
-        </w:tc>
-        <w:tc>
-          <w:tcPr>
-            <w:tcW w:type="dxa" w:w="3005"/>
-          </w:tcPr>
-          <w:p>
-            <w:r/>
-            <w:r>
-              <w:rPr>
-                <w:sz w:val="20"/>
-              </w:rPr>
-              <w:t>Manifestação dos Pontos Focais (SEI 140422979)</w:t>
+              <w:t>Manter a análise sobrestada até haver modelo proposto (item 2); então indicar a viabilidade técnica no SEI, as limitações, as necessidades de parametrização e as orientações de uso</w:t>
             </w:r>
           </w:p>
         </w:tc>
@@ -1022,7 +1472,7 @@
       <w:tr>
         <w:tc>
           <w:tcPr>
-            <w:tcW w:type="dxa" w:w="510"/>
+            <w:tcW w:type="dxa" w:w="567"/>
           </w:tcPr>
           <w:p>
             <w:r/>
@@ -1037,7 +1487,7 @@
         </w:tc>
         <w:tc>
           <w:tcPr>
-            <w:tcW w:type="dxa" w:w="1928"/>
+            <w:tcW w:type="dxa" w:w="2381"/>
           </w:tcPr>
           <w:p>
             <w:r/>
@@ -1051,7 +1501,7 @@
         </w:tc>
         <w:tc>
           <w:tcPr>
-            <w:tcW w:type="dxa" w:w="4535"/>
+            <w:tcW w:type="dxa" w:w="6406"/>
           </w:tcPr>
           <w:p>
             <w:r/>
@@ -1063,25 +1513,11 @@
             </w:r>
           </w:p>
         </w:tc>
-        <w:tc>
-          <w:tcPr>
-            <w:tcW w:type="dxa" w:w="3005"/>
-          </w:tcPr>
-          <w:p>
-            <w:r/>
-            <w:r>
-              <w:rPr>
-                <w:sz w:val="20"/>
-              </w:rPr>
-              <w:t>Art. 18 do Regimento Interno</w:t>
-            </w:r>
-          </w:p>
-        </w:tc>
       </w:tr>
       <w:tr>
         <w:tc>
           <w:tcPr>
-            <w:tcW w:type="dxa" w:w="510"/>
+            <w:tcW w:type="dxa" w:w="567"/>
           </w:tcPr>
           <w:p>
             <w:r/>
@@ -1096,7 +1532,7 @@
         </w:tc>
         <w:tc>
           <w:tcPr>
-            <w:tcW w:type="dxa" w:w="1928"/>
+            <w:tcW w:type="dxa" w:w="2381"/>
           </w:tcPr>
           <w:p>
             <w:r/>
@@ -1110,7 +1546,7 @@
         </w:tc>
         <w:tc>
           <w:tcPr>
-            <w:tcW w:type="dxa" w:w="4535"/>
+            <w:tcW w:type="dxa" w:w="6406"/>
           </w:tcPr>
           <w:p>
             <w:r/>
@@ -1119,20 +1555,6 @@
                 <w:sz w:val="20"/>
               </w:rPr>
               <w:t>Decidir sobre eventual definição de unidade e competências, se a solução exigir alteração de estrutura</w:t>
-            </w:r>
-          </w:p>
-        </w:tc>
-        <w:tc>
-          <w:tcPr>
-            <w:tcW w:type="dxa" w:w="3005"/>
-          </w:tcPr>
-          <w:p>
-            <w:r/>
-            <w:r>
-              <w:rPr>
-                <w:sz w:val="20"/>
-              </w:rPr>
-              <w:t>Arts. 14 e 4º do Regimento Interno</w:t>
             </w:r>
           </w:p>
         </w:tc>
@@ -1223,6 +1645,309 @@
       <w:r>
         <w:t xml:space="preserve"> preenchimento obrigatório e adequado dos campos, como destacado pelos Pontos Focais, independentemente do modelo.</w:t>
       </w:r>
+    </w:p>
+    <w:p>
+      <w:pPr>
+        <w:keepNext/>
+        <w:spacing w:before="240" w:after="80"/>
+      </w:pPr>
+      <w:r>
+        <w:rPr>
+          <w:b/>
+          <w:sz w:val="24"/>
+        </w:rPr>
+        <w:t>Documentos de referência anexados à CI nº 77 (modelos de outros órgãos)</w:t>
+      </w:r>
+    </w:p>
+    <w:tbl>
+      <w:tblPr>
+        <w:tblStyle w:val="TableGrid"/>
+        <w:tblW w:type="auto" w:w="0"/>
+        <w:tblLook w:firstColumn="1" w:firstRow="1" w:lastColumn="0" w:lastRow="0" w:noHBand="0" w:noVBand="1" w:val="04A0"/>
+      </w:tblPr>
+      <w:tblGrid>
+        <w:gridCol w:w="4873"/>
+        <w:gridCol w:w="4873"/>
+      </w:tblGrid>
+      <w:tr>
+        <w:tc>
+          <w:tcPr>
+            <w:tcW w:type="dxa" w:w="1587"/>
+            <w:shd w:val="clear" w:color="auto" w:fill="D9E2F3"/>
+          </w:tcPr>
+          <w:p>
+            <w:r/>
+            <w:r>
+              <w:rPr>
+                <w:b/>
+                <w:sz w:val="20"/>
+              </w:rPr>
+              <w:t>Nº SEI</w:t>
+            </w:r>
+          </w:p>
+        </w:tc>
+        <w:tc>
+          <w:tcPr>
+            <w:tcW w:type="dxa" w:w="7767"/>
+            <w:shd w:val="clear" w:color="auto" w:fill="D9E2F3"/>
+          </w:tcPr>
+          <w:p>
+            <w:r/>
+            <w:r>
+              <w:rPr>
+                <w:b/>
+                <w:sz w:val="20"/>
+              </w:rPr>
+              <w:t>Documento</w:t>
+            </w:r>
+          </w:p>
+        </w:tc>
+      </w:tr>
+      <w:tr>
+        <w:tc>
+          <w:tcPr>
+            <w:tcW w:type="dxa" w:w="1587"/>
+          </w:tcPr>
+          <w:p>
+            <w:r/>
+            <w:r>
+              <w:rPr>
+                <w:sz w:val="20"/>
+              </w:rPr>
+              <w:t>139791196</w:t>
+            </w:r>
+          </w:p>
+        </w:tc>
+        <w:tc>
+          <w:tcPr>
+            <w:tcW w:type="dxa" w:w="7767"/>
+          </w:tcPr>
+          <w:p>
+            <w:r/>
+            <w:r>
+              <w:rPr>
+                <w:sz w:val="20"/>
+              </w:rPr>
+              <w:t>Manual de Procedimentos para Formação de Processos – UNIRIO</w:t>
+            </w:r>
+          </w:p>
+        </w:tc>
+      </w:tr>
+      <w:tr>
+        <w:tc>
+          <w:tcPr>
+            <w:tcW w:type="dxa" w:w="1587"/>
+          </w:tcPr>
+          <w:p>
+            <w:r/>
+            <w:r>
+              <w:rPr>
+                <w:sz w:val="20"/>
+              </w:rPr>
+              <w:t>139792172</w:t>
+            </w:r>
+          </w:p>
+        </w:tc>
+        <w:tc>
+          <w:tcPr>
+            <w:tcW w:type="dxa" w:w="7767"/>
+          </w:tcPr>
+          <w:p>
+            <w:r/>
+            <w:r>
+              <w:rPr>
+                <w:sz w:val="20"/>
+              </w:rPr>
+              <w:t>Relatório Técnico 1 – SEI na UNIRIO</w:t>
+            </w:r>
+          </w:p>
+        </w:tc>
+      </w:tr>
+      <w:tr>
+        <w:tc>
+          <w:tcPr>
+            <w:tcW w:type="dxa" w:w="1587"/>
+          </w:tcPr>
+          <w:p>
+            <w:r/>
+            <w:r>
+              <w:rPr>
+                <w:sz w:val="20"/>
+              </w:rPr>
+              <w:t>139791918</w:t>
+            </w:r>
+          </w:p>
+        </w:tc>
+        <w:tc>
+          <w:tcPr>
+            <w:tcW w:type="dxa" w:w="7767"/>
+          </w:tcPr>
+          <w:p>
+            <w:r/>
+            <w:r>
+              <w:rPr>
+                <w:sz w:val="20"/>
+              </w:rPr>
+              <w:t>Relatório Técnico 2 – SEI na UNIRIO</w:t>
+            </w:r>
+          </w:p>
+        </w:tc>
+      </w:tr>
+      <w:tr>
+        <w:tc>
+          <w:tcPr>
+            <w:tcW w:type="dxa" w:w="1587"/>
+          </w:tcPr>
+          <w:p>
+            <w:r/>
+            <w:r>
+              <w:rPr>
+                <w:sz w:val="20"/>
+              </w:rPr>
+              <w:t>139801942</w:t>
+            </w:r>
+          </w:p>
+        </w:tc>
+        <w:tc>
+          <w:tcPr>
+            <w:tcW w:type="dxa" w:w="7767"/>
+          </w:tcPr>
+          <w:p>
+            <w:r/>
+            <w:r>
+              <w:rPr>
+                <w:sz w:val="20"/>
+              </w:rPr>
+              <w:t>Resolução nº 16/2018 – TCM-SP</w:t>
+            </w:r>
+          </w:p>
+        </w:tc>
+      </w:tr>
+      <w:tr>
+        <w:tc>
+          <w:tcPr>
+            <w:tcW w:type="dxa" w:w="1587"/>
+          </w:tcPr>
+          <w:p>
+            <w:r/>
+            <w:r>
+              <w:rPr>
+                <w:sz w:val="20"/>
+              </w:rPr>
+              <w:t>139803039</w:t>
+            </w:r>
+          </w:p>
+        </w:tc>
+        <w:tc>
+          <w:tcPr>
+            <w:tcW w:type="dxa" w:w="7767"/>
+          </w:tcPr>
+          <w:p>
+            <w:r/>
+            <w:r>
+              <w:rPr>
+                <w:sz w:val="20"/>
+              </w:rPr>
+              <w:t>Portaria SG/GAB nº 06/2018 – TCM-SP</w:t>
+            </w:r>
+          </w:p>
+        </w:tc>
+      </w:tr>
+      <w:tr>
+        <w:tc>
+          <w:tcPr>
+            <w:tcW w:type="dxa" w:w="1587"/>
+          </w:tcPr>
+          <w:p>
+            <w:r/>
+            <w:r>
+              <w:rPr>
+                <w:sz w:val="20"/>
+              </w:rPr>
+              <w:t>139803116</w:t>
+            </w:r>
+          </w:p>
+        </w:tc>
+        <w:tc>
+          <w:tcPr>
+            <w:tcW w:type="dxa" w:w="7767"/>
+          </w:tcPr>
+          <w:p>
+            <w:r/>
+            <w:r>
+              <w:rPr>
+                <w:sz w:val="20"/>
+              </w:rPr>
+              <w:t>Portaria SG/GAB nº 04/2018 – TCM-SP</w:t>
+            </w:r>
+          </w:p>
+        </w:tc>
+      </w:tr>
+      <w:tr>
+        <w:tc>
+          <w:tcPr>
+            <w:tcW w:type="dxa" w:w="1587"/>
+          </w:tcPr>
+          <w:p>
+            <w:r/>
+            <w:r>
+              <w:rPr>
+                <w:sz w:val="20"/>
+              </w:rPr>
+              <w:t>139803195</w:t>
+            </w:r>
+          </w:p>
+        </w:tc>
+        <w:tc>
+          <w:tcPr>
+            <w:tcW w:type="dxa" w:w="7767"/>
+          </w:tcPr>
+          <w:p>
+            <w:r/>
+            <w:r>
+              <w:rPr>
+                <w:sz w:val="20"/>
+              </w:rPr>
+              <w:t>Ordem de Serviço nº 04/2026-PGJ – MPRS</w:t>
+            </w:r>
+          </w:p>
+        </w:tc>
+      </w:tr>
+      <w:tr>
+        <w:tc>
+          <w:tcPr>
+            <w:tcW w:type="dxa" w:w="1587"/>
+          </w:tcPr>
+          <w:p>
+            <w:r/>
+            <w:r>
+              <w:rPr>
+                <w:sz w:val="20"/>
+              </w:rPr>
+              <w:t>139804004</w:t>
+            </w:r>
+          </w:p>
+        </w:tc>
+        <w:tc>
+          <w:tcPr>
+            <w:tcW w:type="dxa" w:w="7767"/>
+          </w:tcPr>
+          <w:p>
+            <w:r/>
+            <w:r>
+              <w:rPr>
+                <w:sz w:val="20"/>
+              </w:rPr>
+              <w:t>Portaria-SEPROC nº 1/2021 – TCU</w:t>
+            </w:r>
+          </w:p>
+        </w:tc>
+      </w:tr>
+    </w:tbl>
+    <w:p>
+      <w:pPr>
+        <w:spacing w:after="40"/>
+      </w:pPr>
     </w:p>
     <w:p>
       <w:r>

</xml_diff>

<commit_message>
Despacho ASSGER: detalha questoes sobre gestao atual da DIREO
Co-Authored-By: Claude Sonnet 5.5 <noreply@anthropic.com>
Claude-Session: https://claude.ai/code/session_01CvNgJ9uw3v6S3zr9Vmkpsw
</commit_message>
<xml_diff>
--- a/Despacho_ASSGER_minuta.docx
+++ b/Despacho_ASSGER_minuta.docx
@@ -1036,6 +1036,20 @@
     </w:p>
     <w:p>
       <w:pPr>
+        <w:spacing w:after="60"/>
+      </w:pPr>
+      <w:r>
+        <w:rPr>
+          <w:b/>
+        </w:rPr>
+        <w:t xml:space="preserve">DIREO: </w:t>
+      </w:r>
+      <w:r>
+        <w:t>a CI nº 77 propõe um fluxo para toda a CENTRAL, mas não descreve como a própria diretoria trata hoje os processos que nela ingressam. A duplicidade é ilustrada no sistema ferroviário (concessão da SuperVia e Contrato de Permissão com a TRENS/RJ). A CI afirma que situação semelhante também pode ocorrer em Bondes, Teleférico do Complexo do Alemão e bens patrimoniais, mas não apresenta casos nem quantidade. Para verificar se a dificuldade decorre de insuficiência normativa ou de não observância dos instrumentos existentes, é necessário que a DIREO informe:</w:t>
+      </w:r>
+    </w:p>
+    <w:p>
+      <w:pPr>
         <w:pStyle w:val="ListBullet"/>
         <w:spacing w:after="60"/>
       </w:pPr>
@@ -1043,10 +1057,81 @@
         <w:rPr>
           <w:b/>
         </w:rPr>
-        <w:t>DIREO:</w:t>
+        <w:t>Entrada:</w:t>
       </w:r>
       <w:r>
-        <w:t xml:space="preserve"> não consta manifestação sobre se a diretoria conhece e aplica os instrumentos em vigor, nem sobre como gerencia hoje os processos que a ela chegam.</w:t>
+        <w:t xml:space="preserve"> quem na DIREO recebe e distribui os processos, e se há ponto de entrada único ou se cada superintendência trata os seus;</w:t>
+      </w:r>
+    </w:p>
+    <w:p>
+      <w:pPr>
+        <w:pStyle w:val="ListBullet"/>
+        <w:spacing w:after="60"/>
+      </w:pPr>
+      <w:r>
+        <w:rPr>
+          <w:b/>
+        </w:rPr>
+        <w:t>Consulta prévia:</w:t>
+      </w:r>
+      <w:r>
+        <w:t xml:space="preserve"> se, antes de abrir um processo, a diretoria verifica se já existe outro sobre o assunto e como (pesquisa no SEI, controle próprio);</w:t>
+      </w:r>
+    </w:p>
+    <w:p>
+      <w:pPr>
+        <w:pStyle w:val="ListBullet"/>
+        <w:spacing w:after="60"/>
+      </w:pPr>
+      <w:r>
+        <w:rPr>
+          <w:b/>
+        </w:rPr>
+        <w:t>Vinculação:</w:t>
+      </w:r>
+      <w:r>
+        <w:t xml:space="preserve"> se utiliza a vinculação/relacionamento de processos do SEI;</w:t>
+      </w:r>
+    </w:p>
+    <w:p>
+      <w:pPr>
+        <w:pStyle w:val="ListBullet"/>
+        <w:spacing w:after="60"/>
+      </w:pPr>
+      <w:r>
+        <w:rPr>
+          <w:b/>
+        </w:rPr>
+        <w:t>Abertura:</w:t>
+      </w:r>
+      <w:r>
+        <w:t xml:space="preserve"> qual tipologia e preenchimento de campos adota ao abrir processos, ponto destacado pelos Pontos Focais (SEI 140422979);</w:t>
+      </w:r>
+    </w:p>
+    <w:p>
+      <w:pPr>
+        <w:pStyle w:val="ListBullet"/>
+        <w:spacing w:after="60"/>
+      </w:pPr>
+      <w:r>
+        <w:rPr>
+          <w:b/>
+        </w:rPr>
+        <w:t>Casos:</w:t>
+      </w:r>
+      <w:r>
+        <w:t xml:space="preserve"> quantos processos duplicados ou correlatos foram identificados e quais (por exemplo, SuperVia, TRENS/RJ, Bondes, Teleférico).</w:t>
+      </w:r>
+    </w:p>
+    <w:p>
+      <w:pPr>
+        <w:spacing w:after="40"/>
+      </w:pPr>
+      <w:r>
+        <w:rPr>
+          <w:b/>
+        </w:rPr>
+        <w:t>Demais pontos:</w:t>
       </w:r>
     </w:p>
     <w:p>
@@ -1284,7 +1369,7 @@
               <w:rPr>
                 <w:sz w:val="20"/>
               </w:rPr>
-              <w:t>(a) Informar se conhece e adota os instrumentos em vigor citados pela Auditoria; (b) descrever como a diretoria gerencia os processos que nela ingressam (recebimento, distribuição, consulta a processos existentes, uso da vinculação no SEI, preenchimento de campos); (c) indicar os casos de duplicidade identificados</w:t>
+              <w:t>(a) Informar se conhece e adota os instrumentos em vigor citados pela Auditoria (SEI 140109406); (b) responder às questões sobre a gestão atual dos processos na diretoria, listadas na seção 3</w:t>
             </w:r>
           </w:p>
         </w:tc>

</xml_diff>